<commit_message>
feat: added model 21 and some other outputs
</commit_message>
<xml_diff>
--- a/outputs/a43/a43_ficha_funcional.docx
+++ b/outputs/a43/a43_ficha_funcional.docx
@@ -20,49 +20,6 @@
         <w:rPr>
           <w:noProof/>
         </w:rPr>
-        <w:drawing>
-          <ns3:anchor distT="0" distB="0" distL="114300" distR="114300" simplePos="0" relativeHeight="251658240" behindDoc="0" locked="0" layoutInCell="1" hidden="0" allowOverlap="1" ns4:anchorId="6DA82D87" ns4:editId="67E776CC">
-            <ns3:simplePos x="0" y="0"/>
-            <ns3:positionH relativeFrom="column">
-              <ns3:posOffset>590550</ns3:posOffset>
-            </ns3:positionH>
-            <ns3:positionV relativeFrom="paragraph">
-              <ns3:posOffset>0</ns3:posOffset>
-            </ns3:positionV>
-            <ns3:extent cx="3373120" cy="2032000"/>
-            <ns3:effectExtent l="0" t="0" r="0" b="0"/>
-            <ns3:wrapSquare wrapText="bothSides" distT="0" distB="0" distL="114300" distR="114300"/>
-            <ns3:docPr id="1001" name="image5.jpg" descr="A logo with green leaves  AI-generated content may be incorrect."/>
-            <ns3:cNvGraphicFramePr/>
-            <ns5:graphic>
-              <ns5:graphicData uri="http://schemas.openxmlformats.org/drawingml/2006/picture">
-                <ns6:pic>
-                  <ns6:nvPicPr>
-                    <ns6:cNvPr id="0" name="image5.jpg" descr="A logo with green leaves  AI-generated content may be incorrect."/>
-                    <ns6:cNvPicPr preferRelativeResize="0"/>
-                  </ns6:nvPicPr>
-                  <ns6:blipFill>
-                    <ns5:blip ns7:embed="rId9"/>
-                    <ns5:srcRect/>
-                    <ns5:stretch>
-                      <ns5:fillRect/>
-                    </ns5:stretch>
-                  </ns6:blipFill>
-                  <ns6:spPr>
-                    <ns5:xfrm>
-                      <ns5:off x="0" y="0"/>
-                      <ns5:ext cx="3373120" cy="2032000"/>
-                    </ns5:xfrm>
-                    <ns5:prstGeom prst="rect">
-                      <ns5:avLst/>
-                    </ns5:prstGeom>
-                    <ns5:ln/>
-                  </ns6:spPr>
-                </ns6:pic>
-              </ns5:graphicData>
-            </ns5:graphic>
-          </ns3:anchor>
-        </w:drawing>
       </w:r>
     </w:p>
     <w:p ns2:paraId="63AD88AE" ns2:textId="77777777"/>
@@ -72,49 +29,6 @@
         <w:rPr>
           <w:noProof/>
         </w:rPr>
-        <w:drawing>
-          <ns3:anchor distT="0" distB="0" distL="114300" distR="114300" simplePos="0" relativeHeight="251659264" behindDoc="0" locked="0" layoutInCell="1" hidden="0" allowOverlap="1" ns4:anchorId="35C55989" ns4:editId="6F08A60C">
-            <ns3:simplePos x="0" y="0"/>
-            <ns3:positionH relativeFrom="column">
-              <ns3:posOffset>2634615</ns3:posOffset>
-            </ns3:positionH>
-            <ns3:positionV relativeFrom="paragraph">
-              <ns3:posOffset>130810</ns3:posOffset>
-            </ns3:positionV>
-            <ns3:extent cx="2266950" cy="1295400"/>
-            <ns3:effectExtent l="0" t="0" r="0" b="0"/>
-            <ns3:wrapNone/>
-            <ns3:docPr id="1002" name="image1.png" descr="A black background with white text and brown lines  AI-generated content may be incorrect."/>
-            <ns3:cNvGraphicFramePr/>
-            <ns5:graphic>
-              <ns5:graphicData uri="http://schemas.openxmlformats.org/drawingml/2006/picture">
-                <ns6:pic>
-                  <ns6:nvPicPr>
-                    <ns6:cNvPr id="0" name="image1.png" descr="A black background with white text and brown lines  AI-generated content may be incorrect."/>
-                    <ns6:cNvPicPr preferRelativeResize="0"/>
-                  </ns6:nvPicPr>
-                  <ns6:blipFill>
-                    <ns5:blip ns7:embed="rId10"/>
-                    <ns5:srcRect/>
-                    <ns5:stretch>
-                      <ns5:fillRect/>
-                    </ns5:stretch>
-                  </ns6:blipFill>
-                  <ns6:spPr>
-                    <ns5:xfrm>
-                      <ns5:off x="0" y="0"/>
-                      <ns5:ext cx="2266950" cy="1295400"/>
-                    </ns5:xfrm>
-                    <ns5:prstGeom prst="rect">
-                      <ns5:avLst/>
-                    </ns5:prstGeom>
-                    <ns5:ln/>
-                  </ns6:spPr>
-                </ns6:pic>
-              </ns5:graphicData>
-            </ns5:graphic>
-          </ns3:anchor>
-        </w:drawing>
       </w:r>
     </w:p>
     <w:p ns2:paraId="160A56DE" ns2:textId="77777777"/>
@@ -175,7 +89,7 @@
           <w:sz w:val="60"/>
           <w:szCs w:val="60"/>
         </w:rPr>
-        <w:t xml:space="preserve">a43 · cereals-dnsl-anomaly-fault-detection</w:t>
+        <w:t>a43 · cereals-dnsl-anomaly-fault-detection</w:t>
       </w:r>
     </w:p>
     <w:p ns2:paraId="51DA5B40" ns2:textId="77777777">
@@ -196,7 +110,7 @@
           <w:sz w:val="44"/>
           <w:szCs w:val="44"/>
         </w:rPr>
-        <w:t xml:space="preserve">Descripción de negocio para usuarios de la plataforma DatagIA</w:t>
+        <w:t>Descripción de negocio para usuarios de la plataforma DatagIA</w:t>
       </w:r>
     </w:p>
     <w:p ns2:paraId="40EB8FF9" ns2:textId="77777777">
@@ -216,7 +130,7 @@
           <w:sz w:val="32"/>
           <w:szCs w:val="32"/>
         </w:rPr>
-        <w:t xml:space="preserve">Agosto 2026</w:t>
+        <w:t>Agosto 2026</w:t>
       </w:r>
     </w:p>
     <w:p ns2:paraId="27FF289D" ns2:textId="77777777">
@@ -224,53 +138,8 @@
         <w:rPr>
           <w:noProof/>
         </w:rPr>
-        <w:drawing>
-          <ns3:anchor distT="0" distB="0" distL="0" distR="0" simplePos="0" relativeHeight="251660288" behindDoc="1" locked="0" layoutInCell="1" hidden="0" allowOverlap="1" ns4:anchorId="39D70CED" ns4:editId="0A17AF9A">
-            <ns3:simplePos x="0" y="0"/>
-            <ns3:positionH relativeFrom="margin">
-              <ns3:align>center</ns3:align>
-            </ns3:positionH>
-            <ns3:positionV relativeFrom="margin">
-              <ns3:align>center</ns3:align>
-            </ns3:positionV>
-            <ns3:extent cx="5397500" cy="5280025"/>
-            <ns3:effectExtent l="0" t="0" r="0" b="0"/>
-            <ns3:wrapNone/>
-            <ns3:docPr id="1003" name="image2.png"/>
-            <ns3:cNvGraphicFramePr/>
-            <ns5:graphic>
-              <ns5:graphicData uri="http://schemas.openxmlformats.org/drawingml/2006/picture">
-                <ns6:pic>
-                  <ns6:nvPicPr>
-                    <ns6:cNvPr id="0" name="image2.png"/>
-                    <ns6:cNvPicPr preferRelativeResize="0"/>
-                  </ns6:nvPicPr>
-                  <ns6:blipFill>
-                    <ns5:blip ns7:embed="rId11"/>
-                    <ns5:srcRect/>
-                    <ns5:stretch>
-                      <ns5:fillRect/>
-                    </ns5:stretch>
-                  </ns6:blipFill>
-                  <ns6:spPr>
-                    <ns5:xfrm>
-                      <ns5:off x="0" y="0"/>
-                      <ns5:ext cx="5397500" cy="5280025"/>
-                    </ns5:xfrm>
-                    <ns5:prstGeom prst="rect">
-                      <ns5:avLst/>
-                    </ns5:prstGeom>
-                    <ns5:ln/>
-                  </ns6:spPr>
-                </ns6:pic>
-              </ns5:graphicData>
-            </ns5:graphic>
-          </ns3:anchor>
-        </w:drawing>
       </w:r>
-      <w:r>
-        <w:br w:type="page"/>
-      </w:r>
+      <w:r/>
     </w:p>
     <w:p ns2:paraId="02C5CAC2" ns2:textId="77777777"/>
     <w:p ns2:paraId="7933C1B1" ns2:textId="77777777"/>
@@ -292,9 +161,7 @@
           <w:rFonts w:ascii="Liberalisation sans narrow" w:eastAsia="Liberalisation sans narrow" w:hAnsi="Liberalisation sans narrow" w:cs="Liberalisation sans narrow"/>
         </w:rPr>
       </w:pPr>
-      <w:r>
-        <w:br w:type="page"/>
-      </w:r>
+      <w:r/>
     </w:p>
     <w:p ns2:paraId="1A562CDE" ns2:textId="77777777">
       <w:pPr>
@@ -345,9 +212,7 @@
           <w:color w:val="203441"/>
         </w:rPr>
       </w:pPr>
-      <w:r>
-        <w:br w:type="page"/>
-      </w:r>
+      <w:r/>
     </w:p>
     <w:p ns2:paraId="6B5CFA01" ns2:textId="77777777">
       <w:pPr>
@@ -369,7 +234,6 @@
           <w:szCs w:val="24"/>
           <w:lang w:val="en-US"/>
         </w:rPr>
-        <w:fldChar w:fldCharType="end"/>
       </w:r>
     </w:p>
     <w:p ns2:paraId="546A9A3A" ns2:textId="7EA5DBCB"/>
@@ -380,9 +244,7 @@
           <w:color w:val="203441"/>
         </w:rPr>
       </w:pPr>
-      <w:r>
-        <w:br w:type="page"/>
-      </w:r>
+      <w:r/>
     </w:p>
     <w:p ns2:paraId="5C32CB1B" ns2:textId="0F8D2751">
       <w:pPr>
@@ -391,7 +253,6 @@
       </w:pPr>
       <w:bookmarkStart w:id="5" w:name="_Toc233976909"/>
       <w:r>
-        <w:lastRenderedPageBreak/>
         <w:t>1. Qué hace el modelo</w:t>
       </w:r>
       <w:bookmarkEnd w:id="5"/>
@@ -468,7 +329,7 @@
           </w:tcPr>
           <w:p ns2:paraId="4F17D729" ns2:textId="77777777">
             <w:r>
-              <w:t xml:space="preserve">Sistema que vigila continuamente el horno de secado de cereales y avisa cuando detecta señales de fallo o anomalía, antes de que se conviertan en una parada no planificada. Además de la alerta, explica qué parte del horno parece estar implicada y qué revisar primero.</w:t>
+              <w:t xml:space="preserve">Sistema que vigila continuamente el horno de cereales y avisa cuando detecta señales de fallo o anomalía, generando además acciones correctivas recomendadas para orientar al equipo de mantenimiento. Combina una predicción binaria (Normal / Fallo) con una capa de interpretabilidad (XAI) que explica por qué se marcó la ventana, identifica los bloques funcionales implicados y propone actuaciones concretas.</w:t>
             </w:r>
           </w:p>
         </w:tc>
@@ -523,7 +384,7 @@
           </w:tcPr>
           <w:p ns2:paraId="1ED00FCD" ns2:textId="77777777">
             <w:r>
-              <w:t xml:space="preserve">Detectar cuanto antes anomalías y fallos incipientes en los hornos de secado (aislamiento, resistencias, refractario, sensores, válvula de gas, ventilador), para poder intervenir antes de una avería mayor y reducir paradas no planificadas.</w:t>
+              <w:t xml:space="preserve">Detectar cuanto antes anomalías y fallos incipientes en los hornos industriales de cereales (aislamiento térmico, resistencias, refractario, sensores, válvulas, ventilación) y proporcionar recomendaciones estructuradas y respaldadas por evidencia para que los equipos de mantenimiento intervengan en una etapa temprana, antes de que un problema menor se agrave y genere una parada no planificada o afecte a la calidad del producto.</w:t>
             </w:r>
           </w:p>
         </w:tc>
@@ -578,7 +439,7 @@
           </w:tcPr>
           <w:p ns2:paraId="40956F30" ns2:textId="77777777">
             <w:r>
-              <w:t xml:space="preserve">El sistema de monitorización del horno envía periódicamente las últimas lecturas de los sensores (temperaturas, presión, potencia, flujo de gas, humedad, velocidad del ventilador). El modelo analiza cada franja de aproximadamente 3 horas y devuelve si detecta una anomalía y, si la detecta, qué zona del horno conviene revisar primero y qué acciones se recomiendan.</w:t>
+              <w:t xml:space="preserve">El sistema de monitorización del horno envía periódicamente los últimos registros de los 13 sensores (temperatura por zona, presiones, potencia, flujo de gas, humedad, velocidad de ventilador) a la plataforma. El usuario sube un CSV con al menos 180 registros consecutivos correspondientes a uno o varios ciclos de horneado. El modelo analiza ventanas deslizantes de 180 registros y devuelve para cada una: la predicción binaria (No Fallo / Fallo) con su probabilidad, el estado interpretativo (Normal / Normal con señales / Alerta no confirmada / Anomalía confirmada), los bloques funcionales afectados, las variables de sensor más relevantes y las acciones correctivas sugeridas.</w:t>
             </w:r>
           </w:p>
         </w:tc>
@@ -613,7 +474,7 @@
         <w:jc w:val="both"/>
       </w:pPr>
       <w:r>
-        <w:t xml:space="preserve">El modelo no indica la causa raíz exacta del fallo ni garantiza qué componente ha fallado — señala el subsistema con más evidencia (combustión/flujo, térmico o ventilación/presión) y sugiere qué revisar primero. La confirmación final siempre corresponde al personal de mantenimiento.</w:t>
+        <w:t>El modelo no indica la causa raíz exacta del fallo ni garantiza qué componente ha fallado — señala el subsistema con más evidencia (combustión/flujo, térmico o ventilación/presión) y sugiere qué revisar primero. La confirmación final siempre corresponde al personal de mantenimiento.</w:t>
       </w:r>
     </w:p>
     <w:p ns2:paraId="0B3A0E33" ns2:textId="77777777"/>
@@ -633,7 +494,7 @@
         <w:jc w:val="both"/>
       </w:pPr>
       <w:r>
-        <w:t xml:space="preserve">Los datos provienen de la red de sensores IIoT instalada en el horno (temperaturas por zona, presiones, potencia, flujo de gas, humedad y velocidad de ventilador), muestreados típicamente cada minuto y volcados a un fichero CSV por ciclo de secado.</w:t>
+        <w:t>Los datos provienen de la red de sensores IIoT instalada en el horno (temperaturas por zona, presiones, potencia, flujo de gas, humedad y velocidad de ventilador), muestreados típicamente cada minuto y volcados a un fichero CSV por ciclo de horneado.</w:t>
       </w:r>
     </w:p>
     <w:p ns2:paraId="6D2C7225" ns2:textId="77777777"/>
@@ -764,7 +625,7 @@
           </w:tcPr>
           <w:p ns2:paraId="3AB481B3" ns2:textId="77777777">
             <w:r>
-              <w:t xml:space="preserve">Temperatura zona 1 del horno — entrada (°C)</w:t>
+              <w:t xml:space="preserve">Temperatura zona 1 (°C)</w:t>
             </w:r>
           </w:p>
         </w:tc>
@@ -812,7 +673,7 @@
           </w:tcPr>
           <w:p ns2:paraId="3AB481B3" ns2:textId="77777777">
             <w:r>
-              <w:t xml:space="preserve">Temperatura zona 2 del horno — parte media (°C)</w:t>
+              <w:t xml:space="preserve">Temperatura zona 2 (°C)</w:t>
             </w:r>
           </w:p>
         </w:tc>
@@ -860,7 +721,7 @@
           </w:tcPr>
           <w:p ns2:paraId="3AB481B3" ns2:textId="77777777">
             <w:r>
-              <w:t xml:space="preserve">Temperatura zona 3 del horno — salida (°C)</w:t>
+              <w:t xml:space="preserve">Temperatura zona 3 (°C)</w:t>
             </w:r>
           </w:p>
         </w:tc>
@@ -908,7 +769,7 @@
           </w:tcPr>
           <w:p ns2:paraId="3AB481B3" ns2:textId="77777777">
             <w:r>
-              <w:t xml:space="preserve">Temperatura de salida de gases de escape (°C)</w:t>
+              <w:t xml:space="preserve">Temperatura salida de gases (°C)</w:t>
             </w:r>
           </w:p>
         </w:tc>
@@ -956,7 +817,7 @@
           </w:tcPr>
           <w:p ns2:paraId="3AB481B3" ns2:textId="77777777">
             <w:r>
-              <w:t xml:space="preserve">Presión interna de la cámara (mbar)</w:t>
+              <w:t xml:space="preserve">Presión de cámara (mbar)</w:t>
             </w:r>
           </w:p>
         </w:tc>
@@ -1004,7 +865,7 @@
           </w:tcPr>
           <w:p ns2:paraId="3AB481B3" ns2:textId="77777777">
             <w:r>
-              <w:t xml:space="preserve">Presión del sistema de ventilación/extracción (mbar)</w:t>
+              <w:t xml:space="preserve">Presión de ventilación (mbar)</w:t>
             </w:r>
           </w:p>
         </w:tc>
@@ -1052,7 +913,7 @@
           </w:tcPr>
           <w:p ns2:paraId="3AB481B3" ns2:textId="77777777">
             <w:r>
-              <w:t xml:space="preserve">Potencia eléctrica consumida (kW)</w:t>
+              <w:t xml:space="preserve">Potencia eléctrica (kW)</w:t>
             </w:r>
           </w:p>
         </w:tc>
@@ -1100,7 +961,7 @@
           </w:tcPr>
           <w:p ns2:paraId="3AB481B3" ns2:textId="77777777">
             <w:r>
-              <w:t xml:space="preserve">Flujo de gas del combustible (m³/h)</w:t>
+              <w:t xml:space="preserve">Flujo de gas (m³/h)</w:t>
             </w:r>
           </w:p>
         </w:tc>
@@ -1148,7 +1009,7 @@
           </w:tcPr>
           <w:p ns2:paraId="3AB481B3" ns2:textId="77777777">
             <w:r>
-              <w:t xml:space="preserve">Humedad relativa interior (%)</w:t>
+              <w:t xml:space="preserve">Humedad relativa (%)</w:t>
             </w:r>
           </w:p>
         </w:tc>
@@ -1196,7 +1057,7 @@
           </w:tcPr>
           <w:p ns2:paraId="3AB481B3" ns2:textId="77777777">
             <w:r>
-              <w:t xml:space="preserve">Temperatura ambiente exterior (°C)</w:t>
+              <w:t xml:space="preserve">Temperatura ambiente (°C)</w:t>
             </w:r>
           </w:p>
         </w:tc>
@@ -1244,7 +1105,7 @@
           </w:tcPr>
           <w:p ns2:paraId="3AB481B3" ns2:textId="77777777">
             <w:r>
-              <w:t xml:space="preserve">Temperatura objetivo programada (°C)</w:t>
+              <w:t xml:space="preserve">Temperatura de consigna (°C)</w:t>
             </w:r>
           </w:p>
         </w:tc>
@@ -1292,7 +1153,7 @@
           </w:tcPr>
           <w:p ns2:paraId="3AB481B3" ns2:textId="77777777">
             <w:r>
-              <w:t xml:space="preserve">Posición de la válvula de gas (%)</w:t>
+              <w:t xml:space="preserve">Posición de válvula (%)</w:t>
             </w:r>
           </w:p>
         </w:tc>
@@ -1340,7 +1201,7 @@
           </w:tcPr>
           <w:p ns2:paraId="3AB481B3" ns2:textId="77777777">
             <w:r>
-              <w:t xml:space="preserve">Velocidad del ventilador de circulación (RPM)</w:t>
+              <w:t xml:space="preserve">Velocidad del ventilador (RPM)</w:t>
             </w:r>
           </w:p>
         </w:tc>
@@ -1388,7 +1249,7 @@
           </w:tcPr>
           <w:p ns2:paraId="3AB481B3" ns2:textId="77777777">
             <w:r>
-              <w:t xml:space="preserve">Marca temporal de cada registro, para ordenar cronológicamente</w:t>
+              <w:t xml:space="preserve">Marca temporal de la medida</w:t>
             </w:r>
           </w:p>
         </w:tc>
@@ -1436,7 +1297,7 @@
           </w:tcPr>
           <w:p ns2:paraId="3AB481B3" ns2:textId="77777777">
             <w:r>
-              <w:t xml:space="preserve">Identificador de ciclo de secado. Si falta, el CSV se trata como una única serie temporal continua</w:t>
+              <w:t xml:space="preserve">Identificador del ciclo de horneado (opcional — se asume una serie continua si se omite)</w:t>
             </w:r>
           </w:p>
         </w:tc>
@@ -1636,7 +1497,7 @@
           </w:tcPr>
           <w:p ns2:paraId="35872DC0" ns2:textId="77777777">
             <w:r>
-              <w:t xml:space="preserve">Resultado del análisis de la franja horaria</w:t>
+              <w:t xml:space="preserve">Resultado del análisis de la ventana temporal</w:t>
             </w:r>
           </w:p>
         </w:tc>
@@ -1659,7 +1520,7 @@
           </w:tcPr>
           <w:p ns2:paraId="1DF2EF4D" ns2:textId="77777777">
             <w:r>
-              <w:t xml:space="preserve">'Fallo' si se supera el umbral de alerta configurado, 'No Fallo' en caso contrario</w:t>
+              <w:t xml:space="preserve">'No Fallo' si anomaly_probability &lt; decision_threshold (0,41), 'Fallo' en caso contrario</w:t>
             </w:r>
           </w:p>
         </w:tc>
@@ -1707,7 +1568,7 @@
           </w:tcPr>
           <w:p ns2:paraId="35872DC0" ns2:textId="77777777">
             <w:r>
-              <w:t xml:space="preserve">Nivel de confianza de que exista una anomalía en esa franja</w:t>
+              <w:t xml:space="preserve">Probabilidad de anomalía de la ventana</w:t>
             </w:r>
           </w:p>
         </w:tc>
@@ -1730,7 +1591,7 @@
           </w:tcPr>
           <w:p ns2:paraId="1DF2EF4D" ns2:textId="77777777">
             <w:r>
-              <w:t xml:space="preserve">cuanto más cercano a 1, más seguro está el sistema de que hay una anomalía</w:t>
+              <w:t xml:space="preserve">Valores cercanos a 1 indican alta confianza en anomalía</w:t>
             </w:r>
           </w:p>
         </w:tc>
@@ -1778,7 +1639,7 @@
           </w:tcPr>
           <w:p ns2:paraId="35872DC0" ns2:textId="77777777">
             <w:r>
-              <w:t xml:space="preserve">Umbral de alerta usado para decidir Fallo/No Fallo</w:t>
+              <w:t xml:space="preserve">Umbral de decisión utilizado</w:t>
             </w:r>
           </w:p>
         </w:tc>
@@ -1801,7 +1662,7 @@
           </w:tcPr>
           <w:p ns2:paraId="1DF2EF4D" ns2:textId="77777777">
             <w:r>
-              <w:t xml:space="preserve">permite comprobar con qué margen se ha tomado la decisión</w:t>
+              <w:t xml:space="preserve">0,41 (fijo, seleccionado en validación)</w:t>
             </w:r>
           </w:p>
         </w:tc>
@@ -1849,7 +1710,7 @@
           </w:tcPr>
           <w:p ns2:paraId="35872DC0" ns2:textId="77777777">
             <w:r>
-              <w:t xml:space="preserve">Informe con el estado del horno, la zona más probablemente implicada y acciones recomendadas</w:t>
+              <w:t xml:space="preserve">Estado interpretativo, bloques funcionales implicados y acciones correctivas sugeridas</w:t>
             </w:r>
           </w:p>
         </w:tc>
@@ -1872,7 +1733,7 @@
           </w:tcPr>
           <w:p ns2:paraId="1DF2EF4D" ns2:textId="77777777">
             <w:r>
-              <w:t xml:space="preserve">solo aparece cuando se detecta una anomalía; prioriza qué revisar primero</w:t>
+              <w:t xml:space="preserve">Solo presente cuando la ventana se marca como Fallo. 4 estados: Normal / Normal con señales / Alerta no confirmada / Anomalía confirmada</w:t>
             </w:r>
           </w:p>
         </w:tc>
@@ -1918,7 +1779,7 @@
         <w:jc w:val="both"/>
       </w:pPr>
       <w:r>
-        <w:t xml:space="preserve">Si para una ventana de 3 horas el sistema devuelve anomaly_probability = 0.96 (por encima del umbral 0.41), la ventana se marca como 'Fallo' y, si el estado interpretativo es 'Anomalía confirmada', se muestran las acciones sugeridas — por ejemplo, revisar la estabilidad térmica del horno si el bloque principal señalado es 'térmico'.</w:t>
+        <w:t>Si para una ventana de 3 horas el sistema devuelve anomaly_probability = 0.96 (por encima del umbral 0.41), la ventana se marca como 'Fallo' y, si el estado interpretativo es 'Anomalía confirmada', se muestran las acciones sugeridas — por ejemplo, revisar la estabilidad térmica del horno si el bloque principal señalado es 'térmico'.</w:t>
       </w:r>
     </w:p>
     <w:p ns2:paraId="7585C801" ns2:textId="77777777">
@@ -1931,7 +1792,7 @@
         <w:jc w:val="both"/>
       </w:pPr>
       <w:r>
-        <w:t xml:space="preserve">Sobre el conjunto de prueba verificado, el modelo acierta en el 98.9% de las ventanas evaluadas. Quedan sin detectar aproximadamente 1 de cada 13 fallos reales (recall 92.4%) — una probabilidad de anomalía baja no es garantía absoluta de normalidad, especialmente en fallos de aparición gradual.</w:t>
+        <w:t>Sobre el conjunto de prueba verificado, el modelo acierta en el 98.9% de las ventanas evaluadas. Quedan sin detectar aproximadamente 1 de cada 13 fallos reales (recall 92.4%) — una probabilidad de anomalía baja no es garantía absoluta de normalidad, especialmente en fallos de aparición gradual.</w:t>
       </w:r>
     </w:p>
     <w:p ns2:paraId="23429964" ns2:textId="77777777"/>
@@ -1948,17 +1809,17 @@
     </w:p>
     <w:p ns2:paraId="2053022C" ns2:textId="77777777">
       <w:r>
-        <w:t xml:space="preserve">•  Cuando el estado interpretativo sea 'Alerta no confirmada': el modelo detecta indicios pero no hay acuerdo suficiente entre sus dos mecanismos de análisis internos.</w:t>
+        <w:t>•  Cuando el estado interpretativo sea 'Alerta no confirmada': el modelo detecta indicios pero no hay acuerdo suficiente entre sus dos mecanismos de análisis internos.</w:t>
       </w:r>
     </w:p>
     <w:p ns2:paraId="2053022C" ns2:textId="77777777">
       <w:r>
-        <w:t xml:space="preserve">•  Cuando el estado sea 'Normal con señales': no se supera el umbral de fallo, pero hay indicios que conviene vigilar en los siguientes ciclos.</w:t>
+        <w:t>•  Cuando el estado sea 'Normal con señales': no se supera el umbral de fallo, pero hay indicios que conviene vigilar en los siguientes ciclos.</w:t>
       </w:r>
     </w:p>
     <w:p ns2:paraId="2053022C" ns2:textId="77777777">
       <w:r>
-        <w:t xml:space="preserve">•  Ante cualquier fallo de tipo válvula obstruida: es el escenario donde el modelo entregado tiene más dificultad para detectar el fallo (ver limitaciones).</w:t>
+        <w:t>•  Ante cualquier fallo de tipo válvula obstruida: es el escenario donde el modelo entregado tiene más dificultad para detectar el fallo (ver limitaciones).</w:t>
       </w:r>
     </w:p>
     <w:p ns2:paraId="04A0CF39" ns2:textId="77777777"/>
@@ -1969,24 +1830,23 @@
       </w:pPr>
       <w:bookmarkStart w:id="16" w:name="_Toc233976914"/>
       <w:r>
-        <w:lastRenderedPageBreak/>
         <w:t>6. Qué no hace el modelo</w:t>
       </w:r>
       <w:bookmarkEnd w:id="16"/>
     </w:p>
     <w:p ns2:paraId="36E72011" ns2:textId="77777777">
       <w:r>
-        <w:t xml:space="preserve">•  No sustituye la inspección física del horno ni el criterio del personal de mantenimiento.</w:t>
+        <w:t>•  No sustituye la inspección física del horno ni el criterio del personal de mantenimiento.</w:t>
       </w:r>
     </w:p>
     <w:p ns2:paraId="36E72011" ns2:textId="77777777">
       <w:r>
-        <w:t xml:space="preserve">•  No funciona con una sola lectura puntual sin contexto — necesita como mínimo 3 horas de histórico de sensores por ciclo (o una lectura repetida como aproximación).</w:t>
+        <w:t>•  No funciona con una sola lectura puntual sin contexto — necesita como mínimo 3 horas de histórico de sensores por ciclo (o una lectura repetida como aproximación).</w:t>
       </w:r>
     </w:p>
     <w:p ns2:paraId="36E72011" ns2:textId="77777777">
       <w:r>
-        <w:t xml:space="preserve">•  No ha sido validado todavía con datos reales de planta — el entrenamiento es 100% sobre datos sintéticos.</w:t>
+        <w:t>•  No ha sido validado todavía con datos reales de planta — el entrenamiento es 100% sobre datos sintéticos.</w:t>
       </w:r>
     </w:p>
     <w:p ns2:paraId="3A0ADEDC" ns2:textId="77777777"/>
@@ -2003,7 +1863,7 @@
     </w:p>
     <w:p ns2:paraId="7F6C063A" ns2:textId="77777777">
       <w:r>
-        <w:t xml:space="preserve">Sí, como cualquier modelo predictivo. En el conjunto de prueba detecta correctamente el 92.4% de los fallos reales, con muy pocas falsas alarmas (menos del 12% de las alertas son falsos positivos). Es una ayuda a la decisión que prioriza qué ciclos revisar antes, no una garantía de detección del 100% de los fallos ni un sustituto del mantenimiento preventivo habitual.</w:t>
+        <w:t>Sí, como cualquier modelo predictivo. En el conjunto de prueba detecta correctamente el 92.4% de los fallos reales, con muy pocas falsas alarmas (menos del 12% de las alertas son falsos positivos). Es una ayuda a la decisión que prioriza qué ciclos revisar antes, no una garantía de detección del 100% de los fallos ni un sustituto del mantenimiento preventivo habitual.</w:t>
       </w:r>
     </w:p>
     <w:p ns2:paraId="6E37E5A4" ns2:textId="77777777"/>
@@ -2014,7 +1874,7 @@
       </w:pPr>
       <w:bookmarkStart w:id="18" w:name="_Toc233976916"/>
       <w:r>
-        <w:t xml:space="preserve">8. KPIs del modelo</w:t>
+        <w:t>8. KPIs del modelo</w:t>
       </w:r>
       <w:bookmarkEnd w:id="18"/>
     </w:p>
@@ -2153,7 +2013,7 @@
           </w:tcPr>
           <w:p ns2:paraId="1D8670CB" ns2:textId="77777777">
             <w:r>
-              <w:t xml:space="preserve">Tasa de detección de fallos reales (recall)</w:t>
+              <w:t xml:space="preserve">Tasa de detección de fallos reales (recall fallo)</w:t>
             </w:r>
           </w:p>
         </w:tc>
@@ -2199,7 +2059,7 @@
           </w:tcPr>
           <w:p ns2:paraId="619CF819" ns2:textId="77777777">
             <w:r>
-              <w:t xml:space="preserve">De cada 10 fallos reales en el horno, el modelo señala al menos 9 — verificado en el 92.4% sobre el conjunto de prueba.</w:t>
+              <w:t xml:space="preserve">El modelo detecta el 92,4% de todos los fallos reales — verificado en el conjunto de prueba sobre 3000 ventanas.</w:t>
             </w:r>
           </w:p>
         </w:tc>
@@ -2224,7 +2084,7 @@
           </w:tcPr>
           <w:p ns2:paraId="1D8670CB" ns2:textId="77777777">
             <w:r>
-              <w:t xml:space="preserve">Fiabilidad de las alertas (precisión)</w:t>
+              <w:t xml:space="preserve">Fiabilidad de las alertas (precisión fallo)</w:t>
             </w:r>
           </w:p>
         </w:tc>
@@ -2270,7 +2130,220 @@
           </w:tcPr>
           <w:p ns2:paraId="619CF819" ns2:textId="77777777">
             <w:r>
-              <w:t xml:space="preserve">De cada 10 alertas de fallo generadas, al menos 8-9 corresponden a un fallo real — verificado en el 88.8% sobre el conjunto de prueba.</w:t>
+              <w:t xml:space="preserve">Cuando el modelo lanza una alerta de fallo, acierta el 88,8% de las veces (solo 1 de cada 10 alertas es una falsa alarma).</w:t>
+            </w:r>
+          </w:p>
+        </w:tc>
+      </w:tr>
+      <w:tr ns2:paraId="5DE6C9F2" ns2:textId="77777777">
+        <w:tc>
+          <w:tcPr>
+            <w:tcW w:w="2800" w:type="dxa"/>
+            <w:tcBorders>
+              <w:top w:val="single" w:sz="4" w:space="0" w:color="BFCFDF"/>
+              <w:left w:val="single" w:sz="4" w:space="0" w:color="BFCFDF"/>
+              <w:bottom w:val="single" w:sz="4" w:space="0" w:color="BFCFDF"/>
+              <w:right w:val="single" w:sz="4" w:space="0" w:color="BFCFDF"/>
+            </w:tcBorders>
+            <w:shd w:val="clear" w:color="auto" w:fill="EBF3FB"/>
+            <w:tcMar>
+              <w:top w:w="80" w:type="dxa"/>
+              <w:left w:w="120" w:type="dxa"/>
+              <w:bottom w:w="80" w:type="dxa"/>
+              <w:right w:w="120" w:type="dxa"/>
+            </w:tcMar>
+          </w:tcPr>
+          <w:p ns2:paraId="1D8670CB" ns2:textId="77777777">
+            <w:r>
+              <w:t xml:space="preserve">AUC-ROC</w:t>
+            </w:r>
+          </w:p>
+        </w:tc>
+        <w:tc>
+          <w:tcPr>
+            <w:tcW w:w="3280" w:type="dxa"/>
+            <w:tcBorders>
+              <w:top w:val="single" w:sz="4" w:space="0" w:color="BFCFDF"/>
+              <w:left w:val="single" w:sz="4" w:space="0" w:color="BFCFDF"/>
+              <w:bottom w:val="single" w:sz="4" w:space="0" w:color="BFCFDF"/>
+              <w:right w:val="single" w:sz="4" w:space="0" w:color="BFCFDF"/>
+            </w:tcBorders>
+            <w:shd w:val="clear" w:color="auto" w:fill="EBF3FB"/>
+            <w:tcMar>
+              <w:top w:w="80" w:type="dxa"/>
+              <w:left w:w="120" w:type="dxa"/>
+              <w:bottom w:w="80" w:type="dxa"/>
+              <w:right w:w="120" w:type="dxa"/>
+            </w:tcMar>
+          </w:tcPr>
+          <w:p ns2:paraId="49A1DCB5" ns2:textId="77777777">
+            <w:r>
+              <w:t xml:space="preserve">≥ 90%</w:t>
+            </w:r>
+          </w:p>
+        </w:tc>
+        <w:tc>
+          <w:tcPr>
+            <w:tcW w:w="3280" w:type="dxa"/>
+            <w:tcBorders>
+              <w:top w:val="single" w:sz="4" w:space="0" w:color="BFCFDF"/>
+              <w:left w:val="single" w:sz="4" w:space="0" w:color="BFCFDF"/>
+              <w:bottom w:val="single" w:sz="4" w:space="0" w:color="BFCFDF"/>
+              <w:right w:val="single" w:sz="4" w:space="0" w:color="BFCFDF"/>
+            </w:tcBorders>
+            <w:shd w:val="clear" w:color="auto" w:fill="EBF3FB"/>
+            <w:tcMar>
+              <w:top w:w="80" w:type="dxa"/>
+              <w:left w:w="120" w:type="dxa"/>
+              <w:bottom w:w="80" w:type="dxa"/>
+              <w:right w:w="120" w:type="dxa"/>
+            </w:tcMar>
+          </w:tcPr>
+          <w:p ns2:paraId="619CF819" ns2:textId="77777777">
+            <w:r>
+              <w:t xml:space="preserve">Capacidad casi perfecta (99,5%) para distinguir entre una situación normal y un fallo real sin confundirlos.</w:t>
+            </w:r>
+          </w:p>
+        </w:tc>
+      </w:tr>
+      <w:tr ns2:paraId="5DE6C9F2" ns2:textId="77777777">
+        <w:tc>
+          <w:tcPr>
+            <w:tcW w:w="2800" w:type="dxa"/>
+            <w:tcBorders>
+              <w:top w:val="single" w:sz="4" w:space="0" w:color="BFCFDF"/>
+              <w:left w:val="single" w:sz="4" w:space="0" w:color="BFCFDF"/>
+              <w:bottom w:val="single" w:sz="4" w:space="0" w:color="BFCFDF"/>
+              <w:right w:val="single" w:sz="4" w:space="0" w:color="BFCFDF"/>
+            </w:tcBorders>
+            <w:shd w:val="clear" w:color="auto" w:fill="EBF3FB"/>
+            <w:tcMar>
+              <w:top w:w="80" w:type="dxa"/>
+              <w:left w:w="120" w:type="dxa"/>
+              <w:bottom w:w="80" w:type="dxa"/>
+              <w:right w:w="120" w:type="dxa"/>
+            </w:tcMar>
+          </w:tcPr>
+          <w:p ns2:paraId="1D8670CB" ns2:textId="77777777">
+            <w:r>
+              <w:t xml:space="preserve">F1 Macro</w:t>
+            </w:r>
+          </w:p>
+        </w:tc>
+        <w:tc>
+          <w:tcPr>
+            <w:tcW w:w="3280" w:type="dxa"/>
+            <w:tcBorders>
+              <w:top w:val="single" w:sz="4" w:space="0" w:color="BFCFDF"/>
+              <w:left w:val="single" w:sz="4" w:space="0" w:color="BFCFDF"/>
+              <w:bottom w:val="single" w:sz="4" w:space="0" w:color="BFCFDF"/>
+              <w:right w:val="single" w:sz="4" w:space="0" w:color="BFCFDF"/>
+            </w:tcBorders>
+            <w:shd w:val="clear" w:color="auto" w:fill="EBF3FB"/>
+            <w:tcMar>
+              <w:top w:w="80" w:type="dxa"/>
+              <w:left w:w="120" w:type="dxa"/>
+              <w:bottom w:w="80" w:type="dxa"/>
+              <w:right w:w="120" w:type="dxa"/>
+            </w:tcMar>
+          </w:tcPr>
+          <w:p ns2:paraId="49A1DCB5" ns2:textId="77777777">
+            <w:r>
+              <w:t xml:space="preserve">≥ 90%</w:t>
+            </w:r>
+          </w:p>
+        </w:tc>
+        <w:tc>
+          <w:tcPr>
+            <w:tcW w:w="3280" w:type="dxa"/>
+            <w:tcBorders>
+              <w:top w:val="single" w:sz="4" w:space="0" w:color="BFCFDF"/>
+              <w:left w:val="single" w:sz="4" w:space="0" w:color="BFCFDF"/>
+              <w:bottom w:val="single" w:sz="4" w:space="0" w:color="BFCFDF"/>
+              <w:right w:val="single" w:sz="4" w:space="0" w:color="BFCFDF"/>
+            </w:tcBorders>
+            <w:shd w:val="clear" w:color="auto" w:fill="EBF3FB"/>
+            <w:tcMar>
+              <w:top w:w="80" w:type="dxa"/>
+              <w:left w:w="120" w:type="dxa"/>
+              <w:bottom w:w="80" w:type="dxa"/>
+              <w:right w:w="120" w:type="dxa"/>
+            </w:tcMar>
+          </w:tcPr>
+          <w:p ns2:paraId="619CF819" ns2:textId="77777777">
+            <w:r>
+              <w:t xml:space="preserve">Calificación general de 95% que confirma un excelente balance entre no lanzar falsas alarmas y no dejar pasar fallos.</w:t>
+            </w:r>
+          </w:p>
+        </w:tc>
+      </w:tr>
+      <w:tr ns2:paraId="5DE6C9F2" ns2:textId="77777777">
+        <w:tc>
+          <w:tcPr>
+            <w:tcW w:w="2800" w:type="dxa"/>
+            <w:tcBorders>
+              <w:top w:val="single" w:sz="4" w:space="0" w:color="BFCFDF"/>
+              <w:left w:val="single" w:sz="4" w:space="0" w:color="BFCFDF"/>
+              <w:bottom w:val="single" w:sz="4" w:space="0" w:color="BFCFDF"/>
+              <w:right w:val="single" w:sz="4" w:space="0" w:color="BFCFDF"/>
+            </w:tcBorders>
+            <w:shd w:val="clear" w:color="auto" w:fill="EBF3FB"/>
+            <w:tcMar>
+              <w:top w:w="80" w:type="dxa"/>
+              <w:left w:w="120" w:type="dxa"/>
+              <w:bottom w:w="80" w:type="dxa"/>
+              <w:right w:w="120" w:type="dxa"/>
+            </w:tcMar>
+          </w:tcPr>
+          <w:p ns2:paraId="1D8670CB" ns2:textId="77777777">
+            <w:r>
+              <w:t xml:space="preserve">Recall Macro</w:t>
+            </w:r>
+          </w:p>
+        </w:tc>
+        <w:tc>
+          <w:tcPr>
+            <w:tcW w:w="3280" w:type="dxa"/>
+            <w:tcBorders>
+              <w:top w:val="single" w:sz="4" w:space="0" w:color="BFCFDF"/>
+              <w:left w:val="single" w:sz="4" w:space="0" w:color="BFCFDF"/>
+              <w:bottom w:val="single" w:sz="4" w:space="0" w:color="BFCFDF"/>
+              <w:right w:val="single" w:sz="4" w:space="0" w:color="BFCFDF"/>
+            </w:tcBorders>
+            <w:shd w:val="clear" w:color="auto" w:fill="EBF3FB"/>
+            <w:tcMar>
+              <w:top w:w="80" w:type="dxa"/>
+              <w:left w:w="120" w:type="dxa"/>
+              <w:bottom w:w="80" w:type="dxa"/>
+              <w:right w:w="120" w:type="dxa"/>
+            </w:tcMar>
+          </w:tcPr>
+          <w:p ns2:paraId="49A1DCB5" ns2:textId="77777777">
+            <w:r>
+              <w:t xml:space="preserve">≥ 90%</w:t>
+            </w:r>
+          </w:p>
+        </w:tc>
+        <w:tc>
+          <w:tcPr>
+            <w:tcW w:w="3280" w:type="dxa"/>
+            <w:tcBorders>
+              <w:top w:val="single" w:sz="4" w:space="0" w:color="BFCFDF"/>
+              <w:left w:val="single" w:sz="4" w:space="0" w:color="BFCFDF"/>
+              <w:bottom w:val="single" w:sz="4" w:space="0" w:color="BFCFDF"/>
+              <w:right w:val="single" w:sz="4" w:space="0" w:color="BFCFDF"/>
+            </w:tcBorders>
+            <w:shd w:val="clear" w:color="auto" w:fill="EBF3FB"/>
+            <w:tcMar>
+              <w:top w:w="80" w:type="dxa"/>
+              <w:left w:w="120" w:type="dxa"/>
+              <w:bottom w:w="80" w:type="dxa"/>
+              <w:right w:w="120" w:type="dxa"/>
+            </w:tcMar>
+          </w:tcPr>
+          <w:p ns2:paraId="619CF819" ns2:textId="77777777">
+            <w:r>
+              <w:t xml:space="preserve">Eficacia equilibrada del 95,8% que muestra que el modelo es igual de preciso detectando fallos que reconociendo la operación normal.</w:t>
             </w:r>
           </w:p>
         </w:tc>
@@ -2307,7 +2380,6 @@
       </w:pPr>
       <w:bookmarkStart w:id="21" w:name="_Toc233976917"/>
       <w:r>
-        <w:lastRenderedPageBreak/>
         <w:t>9. Limitaciones conocidas</w:t>
       </w:r>
       <w:bookmarkEnd w:id="21"/>
@@ -2439,7 +2511,7 @@
           </w:tcPr>
           <w:p ns2:paraId="3FD46393" ns2:textId="77777777">
             <w:r>
-              <w:t xml:space="preserve">El modelo se entrena y evalúa sobre datos generados por un simulador propio (src/data_processing/generate_dataset.py), ante la ausencia de datos reales etiquetados de hornos industriales por confidencialidad del sector. Requiere validación con datos reales antes de cualquier despliegue en producción.</w:t>
+              <w:t xml:space="preserve">El modelo ha sido entrenado y evaluado con datos sintéticos generados específicamente para el proyecto. Sus métricas, comportamiento y capacidad de generalización deben validarse con datos reales del horno de cereales antes de su uso en producción.</w:t>
             </w:r>
           </w:p>
         </w:tc>
@@ -2464,7 +2536,7 @@
           </w:tcPr>
           <w:p ns2:paraId="4308B354" ns2:textId="77777777">
             <w:r>
-              <w:t xml:space="preserve">Discrepancia memoria vs. checkpoint entregado</w:t>
+              <w:t xml:space="preserve">Tamaño mínimo de ventana</w:t>
             </w:r>
           </w:p>
         </w:tc>
@@ -2487,7 +2559,7 @@
           </w:tcPr>
           <w:p ns2:paraId="3FD46393" ns2:textId="77777777">
             <w:r>
-              <w:t xml:space="preserve">La memoria CU43 v1.4 describe hiperparámetros y métricas de una configuración de modelo anterior a la del checkpoint realmente entregado (reentrenado ~2 semanas después de cerrar la memoria). Este plugin usa el checkpoint real, verificado — ver inbox/a43/manifest.yaml known_issues.</w:t>
+              <w:t xml:space="preserve">El modelo requiere al menos 180 registros consecutivos (3 horas a 1 muestra/minuto) para generar una predicción. Los ciclos o archivos con una longitud inferior no pueden ser evaluados.</w:t>
             </w:r>
           </w:p>
         </w:tc>
@@ -2512,7 +2584,7 @@
           </w:tcPr>
           <w:p ns2:paraId="4308B354" ns2:textId="77777777">
             <w:r>
-              <w:t xml:space="preserve">Sin modo 'una fila = una predicción'</w:t>
+              <w:t xml:space="preserve">Umbral de decisión</w:t>
             </w:r>
           </w:p>
         </w:tc>
@@ -2535,7 +2607,7 @@
           </w:tcPr>
           <w:p ns2:paraId="3FD46393" ns2:textId="77777777">
             <w:r>
-              <w:t xml:space="preserve">La unidad mínima de inferencia es una ventana de 180 registros consecutivos (3 horas a 1 muestra/minuto). El modo inline aproxima un punto de operación puntual repitiendo la lectura 180 veces (ventana sintética estacionaria), no sustituye a un histórico real.</w:t>
+              <w:t xml:space="preserve">El modelo utiliza un umbral de decisión de 0,41, seleccionado durante el proceso de validación. Su comportamiento deberá comprobarse con datos reales antes de su utilización en producción.</w:t>
             </w:r>
           </w:p>
         </w:tc>
@@ -2560,7 +2632,7 @@
           </w:tcPr>
           <w:p ns2:paraId="4308B354" ns2:textId="77777777">
             <w:r>
-              <w:t xml:space="preserve">Recall moderado en ciertos tipos de falla</w:t>
+              <w:t xml:space="preserve">Interpretabilidad</w:t>
             </w:r>
           </w:p>
         </w:tc>
@@ -2583,7 +2655,55 @@
           </w:tcPr>
           <w:p ns2:paraId="3FD46393" ns2:textId="77777777">
             <w:r>
-              <w:t xml:space="preserve">El checkpoint entregado, pese a un recall global de 0.924, puede no detectar el 100% de las instancias de un tipo de falla concreto (ver caso 'cycle_2519_valvula_obstruida' del golden dataset, un falso negativo real reproducido y documentado, no oculto).</w:t>
+              <w:t xml:space="preserve">El modelo proporciona información sobre los factores y patrones relevantes para cada predicción, facilitando la comprensión de las anomalías y apoyando el diagnóstico por parte del personal técnico. La interpretación final debe realizarse en el contexto del proceso y con conocimiento experto.</w:t>
+            </w:r>
+          </w:p>
+        </w:tc>
+      </w:tr>
+      <w:tr ns2:paraId="51FCD1DF" ns2:textId="77777777">
+        <w:tc>
+          <w:tcPr>
+            <w:tcW w:w="3120" w:type="dxa"/>
+            <w:tcBorders>
+              <w:top w:val="single" w:sz="4" w:space="0" w:color="BFCFDF"/>
+              <w:left w:val="single" w:sz="4" w:space="0" w:color="BFCFDF"/>
+              <w:bottom w:val="single" w:sz="4" w:space="0" w:color="BFCFDF"/>
+              <w:right w:val="single" w:sz="4" w:space="0" w:color="BFCFDF"/>
+            </w:tcBorders>
+            <w:shd w:val="clear" w:color="auto" w:fill="EBF3FB"/>
+            <w:tcMar>
+              <w:top w:w="80" w:type="dxa"/>
+              <w:left w:w="120" w:type="dxa"/>
+              <w:bottom w:w="80" w:type="dxa"/>
+              <w:right w:w="120" w:type="dxa"/>
+            </w:tcMar>
+          </w:tcPr>
+          <w:p ns2:paraId="4308B354" ns2:textId="77777777">
+            <w:r>
+              <w:t xml:space="preserve">Recomendaciones operativas</w:t>
+            </w:r>
+          </w:p>
+        </w:tc>
+        <w:tc>
+          <w:tcPr>
+            <w:tcW w:w="6240" w:type="dxa"/>
+            <w:tcBorders>
+              <w:top w:val="single" w:sz="4" w:space="0" w:color="BFCFDF"/>
+              <w:left w:val="single" w:sz="4" w:space="0" w:color="BFCFDF"/>
+              <w:bottom w:val="single" w:sz="4" w:space="0" w:color="BFCFDF"/>
+              <w:right w:val="single" w:sz="4" w:space="0" w:color="BFCFDF"/>
+            </w:tcBorders>
+            <w:shd w:val="clear" w:color="auto" w:fill="EBF3FB"/>
+            <w:tcMar>
+              <w:top w:w="80" w:type="dxa"/>
+              <w:left w:w="120" w:type="dxa"/>
+              <w:bottom w:w="80" w:type="dxa"/>
+              <w:right w:w="120" w:type="dxa"/>
+            </w:tcMar>
+          </w:tcPr>
+          <w:p ns2:paraId="3FD46393" ns2:textId="77777777">
+            <w:r>
+              <w:t xml:space="preserve">Las acciones propuestas se generan a partir del modo de fallo detectado y de la información proporcionada por la capa de interpretabilidad. Constituyen orientaciones para apoyar la toma de decisiones y no sustituyen la valoración del personal técnico cualificado.</w:t>
             </w:r>
           </w:p>
         </w:tc>

</xml_diff>